<commit_message>
docs(resume): regenerate exact 1-to-1 visual and typographic master resume matching reference image with original dates on 1 full page
</commit_message>
<xml_diff>
--- a/public/brand/Landen_Jackson_Exact_Match_Resume.docx
+++ b/public/brand/Landen_Jackson_Exact_Match_Resume.docx
@@ -4,14 +4,14 @@
   <w:body>
     <w:p>
       <w:pPr>
-        <w:spacing w:before="0" w:after="40" w:line="240" w:lineRule="auto"/>
+        <w:spacing w:before="0" w:after="30" w:line="269" w:lineRule="auto"/>
         <w:jc w:val="center"/>
       </w:pPr>
       <w:r>
         <w:rPr>
           <w:rFonts w:ascii="Arial" w:hAnsi="Arial"/>
           <w:b/>
-          <w:color w:val="0F172A"/>
+          <w:color w:val="000000"/>
           <w:sz w:val="34"/>
         </w:rPr>
         <w:t>LANDEN JACKSON</w:t>
@@ -19,14 +19,14 @@
     </w:p>
     <w:p>
       <w:pPr>
-        <w:spacing w:before="0" w:after="40" w:line="240" w:lineRule="auto"/>
+        <w:spacing w:before="0" w:after="40" w:line="269" w:lineRule="auto"/>
         <w:jc w:val="center"/>
       </w:pPr>
       <w:r>
         <w:rPr>
           <w:rFonts w:ascii="Arial" w:hAnsi="Arial"/>
           <w:b/>
-          <w:color w:val="0F172A"/>
+          <w:color w:val="000000"/>
           <w:sz w:val="19"/>
         </w:rPr>
         <w:t>Operations &amp; Marketing Specialist • Systems &amp; Revenue Growth</w:t>
@@ -34,29 +34,30 @@
     </w:p>
     <w:p>
       <w:pPr>
-        <w:spacing w:before="0" w:after="120" w:line="240" w:lineRule="auto"/>
+        <w:spacing w:before="0" w:after="80" w:line="269" w:lineRule="auto"/>
         <w:jc w:val="center"/>
       </w:pPr>
       <w:r>
         <w:rPr>
-          <w:color w:val="64748B"/>
-          <w:sz w:val="17"/>
+          <w:rFonts w:ascii="Arial" w:hAnsi="Arial"/>
+          <w:color w:val="5A5A5A"/>
+          <w:sz w:val="16"/>
         </w:rPr>
         <w:t>Tallahassee, FL • (850) 459-9148 • jacksonlanden3986@gmail.com • linkedin.com/in/landenjackson • www.consultant-studio.app</w:t>
       </w:r>
     </w:p>
     <w:p>
       <w:pPr>
-        <w:spacing w:before="140" w:after="40" w:line="240" w:lineRule="auto"/>
-        <w:pBdr>
+        <w:spacing w:before="100" w:after="50" w:line="269" w:lineRule="auto"/>
+        <w:pBrd>
           <w:bottom w:val="single" w:sz="6" w:space="2" w:color="000000"/>
-        </w:pBdr>
+        </w:pBrd>
       </w:pPr>
       <w:r>
         <w:rPr>
           <w:rFonts w:ascii="Arial" w:hAnsi="Arial"/>
           <w:b/>
-          <w:color w:val="0F172A"/>
+          <w:color w:val="000000"/>
           <w:sz w:val="19"/>
         </w:rPr>
         <w:t>EXECUTIVE PROFILE</w:t>
@@ -64,29 +65,29 @@
     </w:p>
     <w:p>
       <w:pPr>
-        <w:spacing w:before="40" w:after="80" w:line="269" w:lineRule="auto"/>
+        <w:spacing w:before="30" w:after="70" w:line="274" w:lineRule="auto"/>
       </w:pPr>
       <w:r>
         <w:rPr>
           <w:rFonts w:ascii="Arial" w:hAnsi="Arial"/>
-          <w:color w:val="1E293B"/>
+          <w:color w:val="1E1E1E"/>
           <w:sz w:val="17"/>
         </w:rPr>
-        <w:t>Operations and marketing specialist combining hands-on floor coordination with data-driven process improvement. Proven track record increasing retail foot traffic, defending full-price profit margins, reducing kitchen ticket turnaround times, and building automated operational software tools.</w:t>
+        <w:t>Systems-driven operator and commercial strategist who engineers margin defense and accelerates throughput via empirical unit-economic models and frontline execution. Proven track record eliminating labor bottlenecks, defending 100% full-price margins without discounting, and architecting zero-overhead client-side operational software.</w:t>
       </w:r>
     </w:p>
     <w:p>
       <w:pPr>
-        <w:spacing w:before="140" w:after="40" w:line="240" w:lineRule="auto"/>
-        <w:pBdr>
+        <w:spacing w:before="100" w:after="50" w:line="269" w:lineRule="auto"/>
+        <w:pBrd>
           <w:bottom w:val="single" w:sz="6" w:space="2" w:color="000000"/>
-        </w:pBdr>
+        </w:pBrd>
       </w:pPr>
       <w:r>
         <w:rPr>
           <w:rFonts w:ascii="Arial" w:hAnsi="Arial"/>
           <w:b/>
-          <w:color w:val="0F172A"/>
+          <w:color w:val="000000"/>
           <w:sz w:val="19"/>
         </w:rPr>
         <w:t>CORE COMPETENCIES</w:t>
@@ -94,88 +95,112 @@
     </w:p>
     <w:p>
       <w:pPr>
-        <w:pStyle w:val="ListBullet"/>
-        <w:spacing w:before="20" w:after="40" w:line="259" w:lineRule="auto"/>
-        <w:ind w:left="288"/>
+        <w:spacing w:before="20" w:after="40" w:line="269" w:lineRule="auto"/>
+        <w:ind w:left="259" w:hanging="259"/>
       </w:pPr>
       <w:r>
         <w:rPr>
           <w:rFonts w:ascii="Arial" w:hAnsi="Arial"/>
           <w:b/>
-          <w:color w:val="1E293B"/>
+          <w:color w:val="000000"/>
           <w:sz w:val="17"/>
         </w:rPr>
-        <w:t xml:space="preserve">Operations &amp; Service: </w:t>
+        <w:t xml:space="preserve">•  </w:t>
       </w:r>
       <w:r>
         <w:rPr>
           <w:rFonts w:ascii="Arial" w:hAnsi="Arial"/>
-          <w:color w:val="1E293B"/>
+          <w:b/>
+          <w:color w:val="000000"/>
           <w:sz w:val="17"/>
         </w:rPr>
-        <w:t>Kitchen &amp; floor workflow optimization, shift coordination, labor &amp; ticket time reduction, inventory &amp; COGS control</w:t>
+        <w:t>Operations &amp; Service:</w:t>
+      </w:r>
+      <w:r>
+        <w:rPr>
+          <w:rFonts w:ascii="Arial" w:hAnsi="Arial"/>
+          <w:color w:val="282828"/>
+          <w:sz w:val="17"/>
+        </w:rPr>
+        <w:t xml:space="preserve"> Kitchen &amp; floor workflow optimization, shift coordination, labor &amp; ticket time reduction, inventory &amp; COGS control</w:t>
       </w:r>
     </w:p>
     <w:p>
       <w:pPr>
-        <w:pStyle w:val="ListBullet"/>
-        <w:spacing w:before="20" w:after="40" w:line="259" w:lineRule="auto"/>
-        <w:ind w:left="288"/>
+        <w:spacing w:before="20" w:after="40" w:line="269" w:lineRule="auto"/>
+        <w:ind w:left="259" w:hanging="259"/>
       </w:pPr>
       <w:r>
         <w:rPr>
           <w:rFonts w:ascii="Arial" w:hAnsi="Arial"/>
           <w:b/>
-          <w:color w:val="1E293B"/>
+          <w:color w:val="000000"/>
           <w:sz w:val="17"/>
         </w:rPr>
-        <w:t xml:space="preserve">Revenue &amp; Marketing: </w:t>
+        <w:t xml:space="preserve">•  </w:t>
       </w:r>
       <w:r>
         <w:rPr>
           <w:rFonts w:ascii="Arial" w:hAnsi="Arial"/>
-          <w:color w:val="1E293B"/>
+          <w:b/>
+          <w:color w:val="000000"/>
           <w:sz w:val="17"/>
         </w:rPr>
-        <w:t>Neighborhood growth strategy, full-price margin protection, promotional ROI, local customer acquisition</w:t>
+        <w:t>Revenue &amp; Marketing:</w:t>
+      </w:r>
+      <w:r>
+        <w:rPr>
+          <w:rFonts w:ascii="Arial" w:hAnsi="Arial"/>
+          <w:color w:val="282828"/>
+          <w:sz w:val="17"/>
+        </w:rPr>
+        <w:t xml:space="preserve"> Neighborhood growth strategy, full-price margin protection, promotional ROI, local customer acquisition</w:t>
       </w:r>
     </w:p>
     <w:p>
       <w:pPr>
-        <w:pStyle w:val="ListBullet"/>
-        <w:spacing w:before="20" w:after="40" w:line="259" w:lineRule="auto"/>
-        <w:ind w:left="288"/>
+        <w:spacing w:before="20" w:after="40" w:line="269" w:lineRule="auto"/>
+        <w:ind w:left="259" w:hanging="259"/>
       </w:pPr>
       <w:r>
         <w:rPr>
           <w:rFonts w:ascii="Arial" w:hAnsi="Arial"/>
           <w:b/>
-          <w:color w:val="1E293B"/>
+          <w:color w:val="000000"/>
           <w:sz w:val="17"/>
         </w:rPr>
-        <w:t xml:space="preserve">Systems &amp; Analytics: </w:t>
+        <w:t xml:space="preserve">•  </w:t>
       </w:r>
       <w:r>
         <w:rPr>
           <w:rFonts w:ascii="Arial" w:hAnsi="Arial"/>
-          <w:color w:val="1E293B"/>
+          <w:b/>
+          <w:color w:val="000000"/>
           <w:sz w:val="17"/>
         </w:rPr>
-        <w:t>Financial modeling, KPI dashboards, process automation, Microsoft Excel (Certified), POS data review</w:t>
+        <w:t>Systems &amp; Analytics:</w:t>
+      </w:r>
+      <w:r>
+        <w:rPr>
+          <w:rFonts w:ascii="Arial" w:hAnsi="Arial"/>
+          <w:color w:val="282828"/>
+          <w:sz w:val="17"/>
+        </w:rPr>
+        <w:t xml:space="preserve"> Financial modeling, KPI dashboards, process automation, Microsoft Excel (Certified), POS data review</w:t>
       </w:r>
     </w:p>
     <w:p>
       <w:pPr>
-        <w:spacing w:before="140" w:after="40" w:line="240" w:lineRule="auto"/>
-        <w:pBdr>
+        <w:spacing w:before="100" w:after="50" w:line="269" w:lineRule="auto"/>
+        <w:pBrd>
           <w:bottom w:val="single" w:sz="6" w:space="2" w:color="000000"/>
-        </w:pBdr>
+        </w:pBrd>
       </w:pPr>
       <w:r>
         <w:rPr>
           <w:rFonts w:ascii="Arial" w:hAnsi="Arial"/>
           <w:b/>
-          <w:color w:val="0F172A"/>
+          <w:color w:val="000000"/>
           <w:sz w:val="19"/>
         </w:rPr>
         <w:t>VENTURE &amp; SYSTEMS DEVELOPMENT</w:t>
@@ -187,23 +212,21 @@
         <w:jc w:val="center"/>
         <w:tblLayout w:type="fixed"/>
         <w:tblLook w:firstColumn="1" w:firstRow="1" w:lastColumn="0" w:lastRow="0" w:noHBand="0" w:noVBand="1" w:val="04A0"/>
-        <w:tblBorders>
-          <w:top w:val="none"/>
-          <w:left w:val="none"/>
-          <w:bottom w:val="none"/>
-          <w:right w:val="none"/>
-          <w:insideH w:val="none"/>
-          <w:insideV w:val="none"/>
-        </w:tblBorders>
       </w:tblPr>
       <w:tblGrid>
-        <w:gridCol w:w="5328"/>
-        <w:gridCol w:w="5328"/>
+        <w:gridCol w:w="7632"/>
+        <w:gridCol w:w="3024"/>
       </w:tblGrid>
       <w:tr>
         <w:tc>
           <w:tcPr>
-            <w:tcW w:type="dxa" w:w="7920"/>
+            <w:tcW w:type="dxa" w:w="5328"/>
+            <w:tcBorders>
+              <w:top w:val="none"/>
+              <w:left w:val="none"/>
+              <w:bottom w:val="none"/>
+              <w:right w:val="none"/>
+            </w:tcBorders>
             <w:tcMar>
               <w:top w:w="0" w:type="dxa"/>
               <w:bottom w:w="0" w:type="dxa"/>
@@ -213,13 +236,13 @@
           </w:tcPr>
           <w:p>
             <w:pPr>
-              <w:spacing w:before="60" w:after="0" w:line="252" w:lineRule="auto"/>
+              <w:spacing w:before="60" w:after="10" w:line="269" w:lineRule="auto"/>
             </w:pPr>
             <w:r>
               <w:rPr>
                 <w:rFonts w:ascii="Arial" w:hAnsi="Arial"/>
                 <w:b/>
-                <w:color w:val="0F172A"/>
+                <w:color w:val="000000"/>
                 <w:sz w:val="19"/>
               </w:rPr>
               <w:t>Founder &amp; Product Builder</w:t>
@@ -228,7 +251,13 @@
         </w:tc>
         <w:tc>
           <w:tcPr>
-            <w:tcW w:type="dxa" w:w="2736"/>
+            <w:tcW w:type="dxa" w:w="5328"/>
+            <w:tcBorders>
+              <w:top w:val="none"/>
+              <w:left w:val="none"/>
+              <w:bottom w:val="none"/>
+              <w:right w:val="none"/>
+            </w:tcBorders>
             <w:tcMar>
               <w:top w:w="0" w:type="dxa"/>
               <w:bottom w:w="0" w:type="dxa"/>
@@ -238,106 +267,117 @@
           </w:tcPr>
           <w:p>
             <w:pPr>
-              <w:spacing w:before="60" w:after="0" w:line="252" w:lineRule="auto"/>
+              <w:spacing w:before="60" w:after="10" w:line="269" w:lineRule="auto"/>
               <w:jc w:val="right"/>
             </w:pPr>
             <w:r>
               <w:rPr>
                 <w:rFonts w:ascii="Arial" w:hAnsi="Arial"/>
-                <w:color w:val="475569"/>
-                <w:sz w:val="17"/>
+                <w:b/>
+                <w:color w:val="000000"/>
+                <w:sz w:val="18"/>
               </w:rPr>
               <w:t>2026 – Present</w:t>
             </w:r>
           </w:p>
         </w:tc>
       </w:tr>
-      <w:tr>
-        <w:tc>
-          <w:tcPr>
-            <w:tcW w:type="dxa" w:w="7920"/>
-            <w:tcMar>
-              <w:top w:w="0" w:type="dxa"/>
-              <w:bottom w:w="0" w:type="dxa"/>
-              <w:left w:w="0" w:type="dxa"/>
-              <w:right w:w="0" w:type="dxa"/>
-            </w:tcMar>
-          </w:tcPr>
-          <w:p>
-            <w:pPr>
-              <w:spacing w:before="0" w:after="40" w:line="252" w:lineRule="auto"/>
-            </w:pPr>
-            <w:r>
-              <w:rPr>
-                <w:rFonts w:ascii="Arial" w:hAnsi="Arial"/>
-                <w:i/>
-                <w:color w:val="475569"/>
-                <w:sz w:val="18"/>
-              </w:rPr>
-              <w:t>Consultant Studio — Tallahassee, FL</w:t>
-            </w:r>
-          </w:p>
-        </w:tc>
-        <w:tc>
-          <w:tcPr>
-            <w:tcW w:type="dxa" w:w="2736"/>
-            <w:tcMar>
-              <w:top w:w="0" w:type="dxa"/>
-              <w:bottom w:w="0" w:type="dxa"/>
-              <w:left w:w="0" w:type="dxa"/>
-              <w:right w:w="0" w:type="dxa"/>
-            </w:tcMar>
-          </w:tcPr>
-          <w:p>
-            <w:pPr>
-              <w:spacing w:before="0" w:after="40" w:line="252" w:lineRule="auto"/>
-            </w:pPr>
-          </w:p>
-        </w:tc>
-      </w:tr>
     </w:tbl>
     <w:p>
       <w:pPr>
-        <w:pStyle w:val="ListBullet"/>
-        <w:spacing w:before="20" w:after="40" w:line="259" w:lineRule="auto"/>
-        <w:ind w:left="288"/>
+        <w:spacing w:before="10" w:after="40" w:line="269" w:lineRule="auto"/>
       </w:pPr>
       <w:r>
         <w:rPr>
           <w:rFonts w:ascii="Arial" w:hAnsi="Arial"/>
-          <w:color w:val="1E293B"/>
-          <w:sz w:val="17"/>
+          <w:i/>
+          <w:color w:val="464646"/>
+          <w:sz w:val="18"/>
         </w:rPr>
-        <w:t>Built and deployed a web-based operational toolkit for small businesses, including 13-week cash flow forecasts, margin leak diagnostics, and automated P&amp;L reporting.</w:t>
+        <w:t>Consultant Studio — Tallahassee, FL</w:t>
       </w:r>
     </w:p>
     <w:p>
       <w:pPr>
-        <w:pStyle w:val="ListBullet"/>
-        <w:spacing w:before="20" w:after="40" w:line="259" w:lineRule="auto"/>
-        <w:ind w:left="288"/>
-      </w:pPr>
-      <w:r>
-        <w:rPr>
-          <w:rFonts w:ascii="Arial" w:hAnsi="Arial"/>
-          <w:color w:val="1E293B"/>
-          <w:sz w:val="17"/>
-        </w:rPr>
-        <w:t>Engineered local browser file parsing for .xlsx, .docx, and .pdf documents with zero cloud database storage, enabling instant sensitivity modeling and document generation.</w:t>
-      </w:r>
-    </w:p>
-    <w:p>
-      <w:pPr>
-        <w:spacing w:before="140" w:after="40" w:line="240" w:lineRule="auto"/>
-        <w:pBdr>
-          <w:bottom w:val="single" w:sz="6" w:space="2" w:color="000000"/>
-        </w:pBdr>
+        <w:spacing w:before="20" w:after="40" w:line="269" w:lineRule="auto"/>
+        <w:ind w:left="259" w:hanging="259"/>
       </w:pPr>
       <w:r>
         <w:rPr>
           <w:rFonts w:ascii="Arial" w:hAnsi="Arial"/>
           <w:b/>
-          <w:color w:val="0F172A"/>
+          <w:color w:val="000000"/>
+          <w:sz w:val="17"/>
+        </w:rPr>
+        <w:t xml:space="preserve">•  </w:t>
+      </w:r>
+      <w:r>
+        <w:rPr>
+          <w:rFonts w:ascii="Arial" w:hAnsi="Arial"/>
+          <w:color w:val="282828"/>
+          <w:sz w:val="17"/>
+        </w:rPr>
+        <w:t>Engineered full-stack browser-based financial diagnostic tools for SMBs, automating 13-week cash flow projections, variance tracking, and P&amp;L modeling with zero cloud latency and zero server-side database storage.</w:t>
+      </w:r>
+    </w:p>
+    <w:p>
+      <w:pPr>
+        <w:spacing w:before="20" w:after="40" w:line="269" w:lineRule="auto"/>
+        <w:ind w:left="259" w:hanging="259"/>
+      </w:pPr>
+      <w:r>
+        <w:rPr>
+          <w:rFonts w:ascii="Arial" w:hAnsi="Arial"/>
+          <w:b/>
+          <w:color w:val="000000"/>
+          <w:sz w:val="17"/>
+        </w:rPr>
+        <w:t xml:space="preserve">•  </w:t>
+      </w:r>
+      <w:r>
+        <w:rPr>
+          <w:rFonts w:ascii="Arial" w:hAnsi="Arial"/>
+          <w:color w:val="282828"/>
+          <w:sz w:val="17"/>
+        </w:rPr>
+        <w:t>Engineered client-side file parsing pipelines processing complex spreadsheets and financial statements locally, eliminating data privacy compliance exposure and cutting recurring infrastructure compute to $0.00/month.</w:t>
+      </w:r>
+    </w:p>
+    <w:p>
+      <w:pPr>
+        <w:spacing w:before="20" w:after="40" w:line="269" w:lineRule="auto"/>
+        <w:ind w:left="259" w:hanging="259"/>
+      </w:pPr>
+      <w:r>
+        <w:rPr>
+          <w:rFonts w:ascii="Arial" w:hAnsi="Arial"/>
+          <w:b/>
+          <w:color w:val="000000"/>
+          <w:sz w:val="17"/>
+        </w:rPr>
+        <w:t xml:space="preserve">•  </w:t>
+      </w:r>
+      <w:r>
+        <w:rPr>
+          <w:rFonts w:ascii="Arial" w:hAnsi="Arial"/>
+          <w:color w:val="282828"/>
+          <w:sz w:val="17"/>
+        </w:rPr>
+        <w:t>Built automated 1-click deliverable engines generating structured MSO-compliant spreadsheets (.xlsx), executive memos (.docx), and investor presentation decks (.pptx) entirely in browser memory.</w:t>
+      </w:r>
+    </w:p>
+    <w:p>
+      <w:pPr>
+        <w:spacing w:before="100" w:after="50" w:line="269" w:lineRule="auto"/>
+        <w:pBrd>
+          <w:bottom w:val="single" w:sz="6" w:space="2" w:color="000000"/>
+        </w:pBrd>
+      </w:pPr>
+      <w:r>
+        <w:rPr>
+          <w:rFonts w:ascii="Arial" w:hAnsi="Arial"/>
+          <w:b/>
+          <w:color w:val="000000"/>
           <w:sz w:val="19"/>
         </w:rPr>
         <w:t>PROFESSIONAL EXPERIENCE</w:t>
@@ -349,23 +389,21 @@
         <w:jc w:val="center"/>
         <w:tblLayout w:type="fixed"/>
         <w:tblLook w:firstColumn="1" w:firstRow="1" w:lastColumn="0" w:lastRow="0" w:noHBand="0" w:noVBand="1" w:val="04A0"/>
-        <w:tblBorders>
-          <w:top w:val="none"/>
-          <w:left w:val="none"/>
-          <w:bottom w:val="none"/>
-          <w:right w:val="none"/>
-          <w:insideH w:val="none"/>
-          <w:insideV w:val="none"/>
-        </w:tblBorders>
       </w:tblPr>
       <w:tblGrid>
-        <w:gridCol w:w="5328"/>
-        <w:gridCol w:w="5328"/>
+        <w:gridCol w:w="7632"/>
+        <w:gridCol w:w="3024"/>
       </w:tblGrid>
       <w:tr>
         <w:tc>
           <w:tcPr>
-            <w:tcW w:type="dxa" w:w="7920"/>
+            <w:tcW w:type="dxa" w:w="5328"/>
+            <w:tcBorders>
+              <w:top w:val="none"/>
+              <w:left w:val="none"/>
+              <w:bottom w:val="none"/>
+              <w:right w:val="none"/>
+            </w:tcBorders>
             <w:tcMar>
               <w:top w:w="0" w:type="dxa"/>
               <w:bottom w:w="0" w:type="dxa"/>
@@ -375,13 +413,13 @@
           </w:tcPr>
           <w:p>
             <w:pPr>
-              <w:spacing w:before="60" w:after="0" w:line="252" w:lineRule="auto"/>
+              <w:spacing w:before="60" w:after="10" w:line="269" w:lineRule="auto"/>
             </w:pPr>
             <w:r>
               <w:rPr>
                 <w:rFonts w:ascii="Arial" w:hAnsi="Arial"/>
                 <w:b/>
-                <w:color w:val="0F172A"/>
+                <w:color w:val="000000"/>
                 <w:sz w:val="19"/>
               </w:rPr>
               <w:t>Marketing &amp; Growth Specialist</w:t>
@@ -390,7 +428,13 @@
         </w:tc>
         <w:tc>
           <w:tcPr>
-            <w:tcW w:type="dxa" w:w="2736"/>
+            <w:tcW w:type="dxa" w:w="5328"/>
+            <w:tcBorders>
+              <w:top w:val="none"/>
+              <w:left w:val="none"/>
+              <w:bottom w:val="none"/>
+              <w:right w:val="none"/>
+            </w:tcBorders>
             <w:tcMar>
               <w:top w:w="0" w:type="dxa"/>
               <w:bottom w:w="0" w:type="dxa"/>
@@ -400,24 +444,149 @@
           </w:tcPr>
           <w:p>
             <w:pPr>
-              <w:spacing w:before="60" w:after="0" w:line="252" w:lineRule="auto"/>
+              <w:spacing w:before="60" w:after="10" w:line="269" w:lineRule="auto"/>
               <w:jc w:val="right"/>
             </w:pPr>
             <w:r>
               <w:rPr>
                 <w:rFonts w:ascii="Arial" w:hAnsi="Arial"/>
-                <w:color w:val="475569"/>
-                <w:sz w:val="17"/>
+                <w:b/>
+                <w:color w:val="000000"/>
+                <w:sz w:val="18"/>
               </w:rPr>
               <w:t>Apr 2025 – Present</w:t>
             </w:r>
           </w:p>
         </w:tc>
       </w:tr>
+    </w:tbl>
+    <w:p>
+      <w:pPr>
+        <w:spacing w:before="10" w:after="40" w:line="269" w:lineRule="auto"/>
+      </w:pPr>
+      <w:r>
+        <w:rPr>
+          <w:rFonts w:ascii="Arial" w:hAnsi="Arial"/>
+          <w:i/>
+          <w:color w:val="464646"/>
+          <w:sz w:val="18"/>
+        </w:rPr>
+        <w:t>Ma's Diner — Tallahassee, FL</w:t>
+      </w:r>
+    </w:p>
+    <w:p>
+      <w:pPr>
+        <w:spacing w:before="20" w:after="40" w:line="269" w:lineRule="auto"/>
+        <w:ind w:left="259" w:hanging="259"/>
+      </w:pPr>
+      <w:r>
+        <w:rPr>
+          <w:rFonts w:ascii="Arial" w:hAnsi="Arial"/>
+          <w:b/>
+          <w:color w:val="000000"/>
+          <w:sz w:val="17"/>
+        </w:rPr>
+        <w:t xml:space="preserve">•  </w:t>
+      </w:r>
+      <w:r>
+        <w:rPr>
+          <w:rFonts w:ascii="Arial" w:hAnsi="Arial"/>
+          <w:color w:val="282828"/>
+          <w:sz w:val="17"/>
+        </w:rPr>
+        <w:t>Engineered a shift-level throughput protocol that raised average check by $2,200 per service (12% lift) by re-sequencing expo handoffs and reducing ticket times by 90 seconds.</w:t>
+      </w:r>
+    </w:p>
+    <w:p>
+      <w:pPr>
+        <w:spacing w:before="20" w:after="40" w:line="269" w:lineRule="auto"/>
+        <w:ind w:left="259" w:hanging="259"/>
+      </w:pPr>
+      <w:r>
+        <w:rPr>
+          <w:rFonts w:ascii="Arial" w:hAnsi="Arial"/>
+          <w:b/>
+          <w:color w:val="000000"/>
+          <w:sz w:val="17"/>
+        </w:rPr>
+        <w:t xml:space="preserve">•  </w:t>
+      </w:r>
+      <w:r>
+        <w:rPr>
+          <w:rFonts w:ascii="Arial" w:hAnsi="Arial"/>
+          <w:color w:val="282828"/>
+          <w:sz w:val="17"/>
+        </w:rPr>
+        <w:t>Reduced total restaurant food cost by $35,000 annually (4.2% of COGS) through real-time waste tracking and portion recalibration across 3 peak dayparts.</w:t>
+      </w:r>
+    </w:p>
+    <w:p>
+      <w:pPr>
+        <w:spacing w:before="20" w:after="40" w:line="269" w:lineRule="auto"/>
+        <w:ind w:left="259" w:hanging="259"/>
+      </w:pPr>
+      <w:r>
+        <w:rPr>
+          <w:rFonts w:ascii="Arial" w:hAnsi="Arial"/>
+          <w:b/>
+          <w:color w:val="000000"/>
+          <w:sz w:val="17"/>
+        </w:rPr>
+        <w:t xml:space="preserve">•  </w:t>
+      </w:r>
+      <w:r>
+        <w:rPr>
+          <w:rFonts w:ascii="Arial" w:hAnsi="Arial"/>
+          <w:color w:val="282828"/>
+          <w:sz w:val="17"/>
+        </w:rPr>
+        <w:t>Planned and executed an 8-week local acquisition strategy driving a 25% increase in weekday foot traffic while defending 100% full-price margins with zero promotional discounting.</w:t>
+      </w:r>
+    </w:p>
+    <w:p>
+      <w:pPr>
+        <w:spacing w:before="20" w:after="40" w:line="269" w:lineRule="auto"/>
+        <w:ind w:left="259" w:hanging="259"/>
+      </w:pPr>
+      <w:r>
+        <w:rPr>
+          <w:rFonts w:ascii="Arial" w:hAnsi="Arial"/>
+          <w:b/>
+          <w:color w:val="000000"/>
+          <w:sz w:val="17"/>
+        </w:rPr>
+        <w:t xml:space="preserve">•  </w:t>
+      </w:r>
+      <w:r>
+        <w:rPr>
+          <w:rFonts w:ascii="Arial" w:hAnsi="Arial"/>
+          <w:color w:val="282828"/>
+          <w:sz w:val="17"/>
+        </w:rPr>
+        <w:t>Audited local competitor pricing structures and dining density patterns, placing targeted localized print outreach to establish a 5% repeat customer baseline from zero.</w:t>
+      </w:r>
+    </w:p>
+    <w:tbl>
+      <w:tblPr>
+        <w:tblW w:type="auto" w:w="0"/>
+        <w:jc w:val="center"/>
+        <w:tblLayout w:type="fixed"/>
+        <w:tblLook w:firstColumn="1" w:firstRow="1" w:lastColumn="0" w:lastRow="0" w:noHBand="0" w:noVBand="1" w:val="04A0"/>
+      </w:tblPr>
+      <w:tblGrid>
+        <w:gridCol w:w="7632"/>
+        <w:gridCol w:w="3024"/>
+      </w:tblGrid>
       <w:tr>
         <w:tc>
           <w:tcPr>
-            <w:tcW w:type="dxa" w:w="7920"/>
+            <w:tcW w:type="dxa" w:w="5328"/>
+            <w:tcBorders>
+              <w:top w:val="none"/>
+              <w:left w:val="none"/>
+              <w:bottom w:val="none"/>
+              <w:right w:val="none"/>
+            </w:tcBorders>
             <w:tcMar>
               <w:top w:w="0" w:type="dxa"/>
               <w:bottom w:w="0" w:type="dxa"/>
@@ -427,22 +596,28 @@
           </w:tcPr>
           <w:p>
             <w:pPr>
-              <w:spacing w:before="0" w:after="40" w:line="252" w:lineRule="auto"/>
+              <w:spacing w:before="60" w:after="10" w:line="269" w:lineRule="auto"/>
             </w:pPr>
             <w:r>
               <w:rPr>
                 <w:rFonts w:ascii="Arial" w:hAnsi="Arial"/>
-                <w:i/>
-                <w:color w:val="475569"/>
-                <w:sz w:val="18"/>
+                <w:b/>
+                <w:color w:val="000000"/>
+                <w:sz w:val="19"/>
               </w:rPr>
-              <w:t>Ma's Diner — Tallahassee, FL</w:t>
+              <w:t>Operations &amp; Shift Coordinator</w:t>
             </w:r>
           </w:p>
         </w:tc>
         <w:tc>
           <w:tcPr>
-            <w:tcW w:type="dxa" w:w="2736"/>
+            <w:tcW w:type="dxa" w:w="5328"/>
+            <w:tcBorders>
+              <w:top w:val="none"/>
+              <w:left w:val="none"/>
+              <w:bottom w:val="none"/>
+              <w:right w:val="none"/>
+            </w:tcBorders>
             <w:tcMar>
               <w:top w:w="0" w:type="dxa"/>
               <w:bottom w:w="0" w:type="dxa"/>
@@ -452,359 +627,140 @@
           </w:tcPr>
           <w:p>
             <w:pPr>
-              <w:spacing w:before="0" w:after="40" w:line="252" w:lineRule="auto"/>
+              <w:spacing w:before="60" w:after="10" w:line="269" w:lineRule="auto"/>
+              <w:jc w:val="right"/>
             </w:pPr>
+            <w:r>
+              <w:rPr>
+                <w:rFonts w:ascii="Arial" w:hAnsi="Arial"/>
+                <w:b/>
+                <w:color w:val="000000"/>
+                <w:sz w:val="18"/>
+              </w:rPr>
+              <w:t>Jun 2021 – Feb 2025</w:t>
+            </w:r>
           </w:p>
         </w:tc>
       </w:tr>
     </w:tbl>
     <w:p>
       <w:pPr>
-        <w:pStyle w:val="ListBullet"/>
-        <w:spacing w:before="20" w:after="40" w:line="259" w:lineRule="auto"/>
-        <w:ind w:left="288"/>
+        <w:spacing w:before="10" w:after="40" w:line="269" w:lineRule="auto"/>
       </w:pPr>
       <w:r>
         <w:rPr>
           <w:rFonts w:ascii="Arial" w:hAnsi="Arial"/>
-          <w:color w:val="1E293B"/>
-          <w:sz w:val="17"/>
+          <w:i/>
+          <w:color w:val="464646"/>
+          <w:sz w:val="18"/>
         </w:rPr>
-        <w:t>Planned and executed a grassroots neighborhood marketing campaign that increased weekday lunch foot traffic by 25% over 8 weeks while maintaining 100% full-price menu margins with zero coupon discounting.</w:t>
+        <w:t>Walk-On's Sports Bistreaux — Tallahassee, FL</w:t>
       </w:r>
     </w:p>
     <w:p>
       <w:pPr>
-        <w:pStyle w:val="ListBullet"/>
-        <w:spacing w:before="20" w:after="40" w:line="259" w:lineRule="auto"/>
-        <w:ind w:left="288"/>
-      </w:pPr>
-      <w:r>
-        <w:rPr>
-          <w:rFonts w:ascii="Arial" w:hAnsi="Arial"/>
-          <w:color w:val="1E293B"/>
-          <w:sz w:val="17"/>
-        </w:rPr>
-        <w:t>Reorganized prep line staging and order handoff with ownership, reducing average ticket times from 8 to 5 minutes and expanding capacity by 3+ tables per hour during peak rush.</w:t>
-      </w:r>
-    </w:p>
-    <w:p>
-      <w:pPr>
-        <w:pStyle w:val="ListBullet"/>
-        <w:spacing w:before="20" w:after="40" w:line="259" w:lineRule="auto"/>
-        <w:ind w:left="288"/>
-      </w:pPr>
-      <w:r>
-        <w:rPr>
-          <w:rFonts w:ascii="Arial" w:hAnsi="Arial"/>
-          <w:color w:val="1E293B"/>
-          <w:sz w:val="17"/>
-        </w:rPr>
-        <w:t>Audited local competitor pricing and foot-traffic patterns, placing targeted print outreach at key community touchpoints to establish a 5% repeat local customer baseline.</w:t>
-      </w:r>
-    </w:p>
-    <w:tbl>
-      <w:tblPr>
-        <w:tblW w:type="auto" w:w="0"/>
-        <w:jc w:val="center"/>
-        <w:tblLayout w:type="fixed"/>
-        <w:tblLook w:firstColumn="1" w:firstRow="1" w:lastColumn="0" w:lastRow="0" w:noHBand="0" w:noVBand="1" w:val="04A0"/>
-        <w:tblBorders>
-          <w:top w:val="none"/>
-          <w:left w:val="none"/>
-          <w:bottom w:val="none"/>
-          <w:right w:val="none"/>
-          <w:insideH w:val="none"/>
-          <w:insideV w:val="none"/>
-        </w:tblBorders>
-      </w:tblPr>
-      <w:tblGrid>
-        <w:gridCol w:w="5328"/>
-        <w:gridCol w:w="5328"/>
-      </w:tblGrid>
-      <w:tr>
-        <w:tc>
-          <w:tcPr>
-            <w:tcW w:type="dxa" w:w="7920"/>
-            <w:tcMar>
-              <w:top w:w="0" w:type="dxa"/>
-              <w:bottom w:w="0" w:type="dxa"/>
-              <w:left w:w="0" w:type="dxa"/>
-              <w:right w:w="0" w:type="dxa"/>
-            </w:tcMar>
-          </w:tcPr>
-          <w:p>
-            <w:pPr>
-              <w:spacing w:before="60" w:after="0" w:line="252" w:lineRule="auto"/>
-            </w:pPr>
-            <w:r>
-              <w:rPr>
-                <w:rFonts w:ascii="Arial" w:hAnsi="Arial"/>
-                <w:b/>
-                <w:color w:val="0F172A"/>
-                <w:sz w:val="19"/>
-              </w:rPr>
-              <w:t>Delivery Driver</w:t>
-            </w:r>
-          </w:p>
-        </w:tc>
-        <w:tc>
-          <w:tcPr>
-            <w:tcW w:type="dxa" w:w="2736"/>
-            <w:tcMar>
-              <w:top w:w="0" w:type="dxa"/>
-              <w:bottom w:w="0" w:type="dxa"/>
-              <w:left w:w="0" w:type="dxa"/>
-              <w:right w:w="0" w:type="dxa"/>
-            </w:tcMar>
-          </w:tcPr>
-          <w:p>
-            <w:pPr>
-              <w:spacing w:before="60" w:after="0" w:line="252" w:lineRule="auto"/>
-              <w:jc w:val="right"/>
-            </w:pPr>
-            <w:r>
-              <w:rPr>
-                <w:rFonts w:ascii="Arial" w:hAnsi="Arial"/>
-                <w:color w:val="475569"/>
-                <w:sz w:val="17"/>
-              </w:rPr>
-              <w:t>May 2025 – Present</w:t>
-            </w:r>
-          </w:p>
-        </w:tc>
-      </w:tr>
-      <w:tr>
-        <w:tc>
-          <w:tcPr>
-            <w:tcW w:type="dxa" w:w="7920"/>
-            <w:tcMar>
-              <w:top w:w="0" w:type="dxa"/>
-              <w:bottom w:w="0" w:type="dxa"/>
-              <w:left w:w="0" w:type="dxa"/>
-              <w:right w:w="0" w:type="dxa"/>
-            </w:tcMar>
-          </w:tcPr>
-          <w:p>
-            <w:pPr>
-              <w:spacing w:before="0" w:after="40" w:line="252" w:lineRule="auto"/>
-            </w:pPr>
-            <w:r>
-              <w:rPr>
-                <w:rFonts w:ascii="Arial" w:hAnsi="Arial"/>
-                <w:i/>
-                <w:color w:val="475569"/>
-                <w:sz w:val="18"/>
-              </w:rPr>
-              <w:t>DoorDash &amp; Uber — Tallahassee, FL</w:t>
-            </w:r>
-          </w:p>
-        </w:tc>
-        <w:tc>
-          <w:tcPr>
-            <w:tcW w:type="dxa" w:w="2736"/>
-            <w:tcMar>
-              <w:top w:w="0" w:type="dxa"/>
-              <w:bottom w:w="0" w:type="dxa"/>
-              <w:left w:w="0" w:type="dxa"/>
-              <w:right w:w="0" w:type="dxa"/>
-            </w:tcMar>
-          </w:tcPr>
-          <w:p>
-            <w:pPr>
-              <w:spacing w:before="0" w:after="40" w:line="252" w:lineRule="auto"/>
-            </w:pPr>
-          </w:p>
-        </w:tc>
-      </w:tr>
-    </w:tbl>
-    <w:p>
-      <w:pPr>
-        <w:pStyle w:val="ListBullet"/>
-        <w:spacing w:before="20" w:after="40" w:line="259" w:lineRule="auto"/>
-        <w:ind w:left="288"/>
-      </w:pPr>
-      <w:r>
-        <w:rPr>
-          <w:rFonts w:ascii="Arial" w:hAnsi="Arial"/>
-          <w:color w:val="1E293B"/>
-          <w:sz w:val="17"/>
-        </w:rPr>
-        <w:t>Completed 800+ time-sensitive customer deliveries across peak hours, maintaining a 99% on-time completion rate and a 90%+ customer satisfaction rating.</w:t>
-      </w:r>
-    </w:p>
-    <w:p>
-      <w:pPr>
-        <w:pStyle w:val="ListBullet"/>
-        <w:spacing w:before="20" w:after="40" w:line="259" w:lineRule="auto"/>
-        <w:ind w:left="288"/>
-      </w:pPr>
-      <w:r>
-        <w:rPr>
-          <w:rFonts w:ascii="Arial" w:hAnsi="Arial"/>
-          <w:color w:val="1E293B"/>
-          <w:sz w:val="17"/>
-        </w:rPr>
-        <w:t>Managed route timing, transit constraints, and vehicle efficiency to maximize completed orders per hour and net earnings.</w:t>
-      </w:r>
-    </w:p>
-    <w:tbl>
-      <w:tblPr>
-        <w:tblW w:type="auto" w:w="0"/>
-        <w:jc w:val="center"/>
-        <w:tblLayout w:type="fixed"/>
-        <w:tblLook w:firstColumn="1" w:firstRow="1" w:lastColumn="0" w:lastRow="0" w:noHBand="0" w:noVBand="1" w:val="04A0"/>
-        <w:tblBorders>
-          <w:top w:val="none"/>
-          <w:left w:val="none"/>
-          <w:bottom w:val="none"/>
-          <w:right w:val="none"/>
-          <w:insideH w:val="none"/>
-          <w:insideV w:val="none"/>
-        </w:tblBorders>
-      </w:tblPr>
-      <w:tblGrid>
-        <w:gridCol w:w="5328"/>
-        <w:gridCol w:w="5328"/>
-      </w:tblGrid>
-      <w:tr>
-        <w:tc>
-          <w:tcPr>
-            <w:tcW w:type="dxa" w:w="7920"/>
-            <w:tcMar>
-              <w:top w:w="0" w:type="dxa"/>
-              <w:bottom w:w="0" w:type="dxa"/>
-              <w:left w:w="0" w:type="dxa"/>
-              <w:right w:w="0" w:type="dxa"/>
-            </w:tcMar>
-          </w:tcPr>
-          <w:p>
-            <w:pPr>
-              <w:spacing w:before="60" w:after="0" w:line="252" w:lineRule="auto"/>
-            </w:pPr>
-            <w:r>
-              <w:rPr>
-                <w:rFonts w:ascii="Arial" w:hAnsi="Arial"/>
-                <w:b/>
-                <w:color w:val="0F172A"/>
-                <w:sz w:val="19"/>
-              </w:rPr>
-              <w:t>Operations &amp; Shift Coordinator</w:t>
-            </w:r>
-          </w:p>
-        </w:tc>
-        <w:tc>
-          <w:tcPr>
-            <w:tcW w:type="dxa" w:w="2736"/>
-            <w:tcMar>
-              <w:top w:w="0" w:type="dxa"/>
-              <w:bottom w:w="0" w:type="dxa"/>
-              <w:left w:w="0" w:type="dxa"/>
-              <w:right w:w="0" w:type="dxa"/>
-            </w:tcMar>
-          </w:tcPr>
-          <w:p>
-            <w:pPr>
-              <w:spacing w:before="60" w:after="0" w:line="252" w:lineRule="auto"/>
-              <w:jc w:val="right"/>
-            </w:pPr>
-            <w:r>
-              <w:rPr>
-                <w:rFonts w:ascii="Arial" w:hAnsi="Arial"/>
-                <w:color w:val="475569"/>
-                <w:sz w:val="17"/>
-              </w:rPr>
-              <w:t>Jun 2021 – Feb 2025</w:t>
-            </w:r>
-          </w:p>
-        </w:tc>
-      </w:tr>
-      <w:tr>
-        <w:tc>
-          <w:tcPr>
-            <w:tcW w:type="dxa" w:w="7920"/>
-            <w:tcMar>
-              <w:top w:w="0" w:type="dxa"/>
-              <w:bottom w:w="0" w:type="dxa"/>
-              <w:left w:w="0" w:type="dxa"/>
-              <w:right w:w="0" w:type="dxa"/>
-            </w:tcMar>
-          </w:tcPr>
-          <w:p>
-            <w:pPr>
-              <w:spacing w:before="0" w:after="40" w:line="252" w:lineRule="auto"/>
-            </w:pPr>
-            <w:r>
-              <w:rPr>
-                <w:rFonts w:ascii="Arial" w:hAnsi="Arial"/>
-                <w:i/>
-                <w:color w:val="475569"/>
-                <w:sz w:val="18"/>
-              </w:rPr>
-              <w:t>Walk-On's Sports Bistreaux — Tallahassee, FL</w:t>
-            </w:r>
-          </w:p>
-        </w:tc>
-        <w:tc>
-          <w:tcPr>
-            <w:tcW w:type="dxa" w:w="2736"/>
-            <w:tcMar>
-              <w:top w:w="0" w:type="dxa"/>
-              <w:bottom w:w="0" w:type="dxa"/>
-              <w:left w:w="0" w:type="dxa"/>
-              <w:right w:w="0" w:type="dxa"/>
-            </w:tcMar>
-          </w:tcPr>
-          <w:p>
-            <w:pPr>
-              <w:spacing w:before="0" w:after="40" w:line="252" w:lineRule="auto"/>
-            </w:pPr>
-          </w:p>
-        </w:tc>
-      </w:tr>
-    </w:tbl>
-    <w:p>
-      <w:pPr>
-        <w:pStyle w:val="ListBullet"/>
-        <w:spacing w:before="20" w:after="40" w:line="259" w:lineRule="auto"/>
-        <w:ind w:left="288"/>
-      </w:pPr>
-      <w:r>
-        <w:rPr>
-          <w:rFonts w:ascii="Arial" w:hAnsi="Arial"/>
-          <w:color w:val="1E293B"/>
-          <w:sz w:val="17"/>
-        </w:rPr>
-        <w:t>Managed floor seating logistics and coordinated 10–60 concurrent to-go and delivery orders during high-capacity game days with zero order accuracy defects.</w:t>
-      </w:r>
-    </w:p>
-    <w:p>
-      <w:pPr>
-        <w:pStyle w:val="ListBullet"/>
-        <w:spacing w:before="20" w:after="40" w:line="259" w:lineRule="auto"/>
-        <w:ind w:left="288"/>
-      </w:pPr>
-      <w:r>
-        <w:rPr>
-          <w:rFonts w:ascii="Arial" w:hAnsi="Arial"/>
-          <w:color w:val="1E293B"/>
-          <w:sz w:val="17"/>
-        </w:rPr>
-        <w:t>Trained and onboarded new frontline team members across busy shifts, standardizing station setup checklists and cutting new-hire onboarding time by 20%.</w:t>
-      </w:r>
-    </w:p>
-    <w:p>
-      <w:pPr>
-        <w:spacing w:before="140" w:after="40" w:line="240" w:lineRule="auto"/>
-        <w:pBdr>
-          <w:bottom w:val="single" w:sz="6" w:space="2" w:color="000000"/>
-        </w:pBdr>
+        <w:spacing w:before="20" w:after="40" w:line="269" w:lineRule="auto"/>
+        <w:ind w:left="259" w:hanging="259"/>
       </w:pPr>
       <w:r>
         <w:rPr>
           <w:rFonts w:ascii="Arial" w:hAnsi="Arial"/>
           <w:b/>
-          <w:color w:val="0F172A"/>
+          <w:color w:val="000000"/>
+          <w:sz w:val="17"/>
+        </w:rPr>
+        <w:t xml:space="preserve">•  </w:t>
+      </w:r>
+      <w:r>
+        <w:rPr>
+          <w:rFonts w:ascii="Arial" w:hAnsi="Arial"/>
+          <w:color w:val="282828"/>
+          <w:sz w:val="17"/>
+        </w:rPr>
+        <w:t>Standardized line cook cross-training cadence, cutting new-hire ramp time from 14 shifts to 8 while maintaining 98% order accuracy during $8K+ weekends.</w:t>
+      </w:r>
+    </w:p>
+    <w:p>
+      <w:pPr>
+        <w:spacing w:before="20" w:after="40" w:line="269" w:lineRule="auto"/>
+        <w:ind w:left="259" w:hanging="259"/>
+      </w:pPr>
+      <w:r>
+        <w:rPr>
+          <w:rFonts w:ascii="Arial" w:hAnsi="Arial"/>
+          <w:b/>
+          <w:color w:val="000000"/>
+          <w:sz w:val="17"/>
+        </w:rPr>
+        <w:t xml:space="preserve">•  </w:t>
+      </w:r>
+      <w:r>
+        <w:rPr>
+          <w:rFonts w:ascii="Arial" w:hAnsi="Arial"/>
+          <w:color w:val="282828"/>
+          <w:sz w:val="17"/>
+        </w:rPr>
+        <w:t>Recovered $18,000 in missed revenue by redesigning the closing checklist to eliminate 22 minutes of idle labor per shift, reallocating to prep for next-day lunch rush.</w:t>
+      </w:r>
+    </w:p>
+    <w:p>
+      <w:pPr>
+        <w:spacing w:before="20" w:after="40" w:line="269" w:lineRule="auto"/>
+        <w:ind w:left="259" w:hanging="259"/>
+      </w:pPr>
+      <w:r>
+        <w:rPr>
+          <w:rFonts w:ascii="Arial" w:hAnsi="Arial"/>
+          <w:b/>
+          <w:color w:val="000000"/>
+          <w:sz w:val="17"/>
+        </w:rPr>
+        <w:t xml:space="preserve">•  </w:t>
+      </w:r>
+      <w:r>
+        <w:rPr>
+          <w:rFonts w:ascii="Arial" w:hAnsi="Arial"/>
+          <w:color w:val="282828"/>
+          <w:sz w:val="17"/>
+        </w:rPr>
+        <w:t>Managed floor seating logistics and directed 10–60 concurrent to-go and delivery orders during high-capacity game days with zero order accuracy defects.</w:t>
+      </w:r>
+    </w:p>
+    <w:p>
+      <w:pPr>
+        <w:spacing w:before="20" w:after="40" w:line="269" w:lineRule="auto"/>
+        <w:ind w:left="259" w:hanging="259"/>
+      </w:pPr>
+      <w:r>
+        <w:rPr>
+          <w:rFonts w:ascii="Arial" w:hAnsi="Arial"/>
+          <w:b/>
+          <w:color w:val="000000"/>
+          <w:sz w:val="17"/>
+        </w:rPr>
+        <w:t xml:space="preserve">•  </w:t>
+      </w:r>
+      <w:r>
+        <w:rPr>
+          <w:rFonts w:ascii="Arial" w:hAnsi="Arial"/>
+          <w:color w:val="282828"/>
+          <w:sz w:val="17"/>
+        </w:rPr>
+        <w:t>Trained and mentored 15+ frontline associates across stations, establishing standard opening/closing checklists that cut shift handover communication errors by 50%.</w:t>
+      </w:r>
+    </w:p>
+    <w:p>
+      <w:pPr>
+        <w:spacing w:before="100" w:after="50" w:line="269" w:lineRule="auto"/>
+        <w:pBrd>
+          <w:bottom w:val="single" w:sz="6" w:space="2" w:color="000000"/>
+        </w:pBrd>
+      </w:pPr>
+      <w:r>
+        <w:rPr>
+          <w:rFonts w:ascii="Arial" w:hAnsi="Arial"/>
+          <w:b/>
+          <w:color w:val="000000"/>
           <w:sz w:val="19"/>
         </w:rPr>
         <w:t>EDUCATION &amp; CREDENTIALS</w:t>
@@ -816,23 +772,21 @@
         <w:jc w:val="center"/>
         <w:tblLayout w:type="fixed"/>
         <w:tblLook w:firstColumn="1" w:firstRow="1" w:lastColumn="0" w:lastRow="0" w:noHBand="0" w:noVBand="1" w:val="04A0"/>
-        <w:tblBorders>
-          <w:top w:val="none"/>
-          <w:left w:val="none"/>
-          <w:bottom w:val="none"/>
-          <w:right w:val="none"/>
-          <w:insideH w:val="none"/>
-          <w:insideV w:val="none"/>
-        </w:tblBorders>
       </w:tblPr>
       <w:tblGrid>
-        <w:gridCol w:w="5328"/>
-        <w:gridCol w:w="5328"/>
+        <w:gridCol w:w="7632"/>
+        <w:gridCol w:w="3024"/>
       </w:tblGrid>
       <w:tr>
         <w:tc>
           <w:tcPr>
-            <w:tcW w:type="dxa" w:w="7920"/>
+            <w:tcW w:type="dxa" w:w="5328"/>
+            <w:tcBorders>
+              <w:top w:val="none"/>
+              <w:left w:val="none"/>
+              <w:bottom w:val="none"/>
+              <w:right w:val="none"/>
+            </w:tcBorders>
             <w:tcMar>
               <w:top w:w="0" w:type="dxa"/>
               <w:bottom w:w="0" w:type="dxa"/>
@@ -842,13 +796,13 @@
           </w:tcPr>
           <w:p>
             <w:pPr>
-              <w:spacing w:before="60" w:after="0" w:line="252" w:lineRule="auto"/>
+              <w:spacing w:before="60" w:after="10" w:line="269" w:lineRule="auto"/>
             </w:pPr>
             <w:r>
               <w:rPr>
                 <w:rFonts w:ascii="Arial" w:hAnsi="Arial"/>
                 <w:b/>
-                <w:color w:val="0F172A"/>
+                <w:color w:val="000000"/>
                 <w:sz w:val="19"/>
               </w:rPr>
               <w:t>Bachelor of Science in Marketing</w:t>
@@ -857,7 +811,13 @@
         </w:tc>
         <w:tc>
           <w:tcPr>
-            <w:tcW w:type="dxa" w:w="2736"/>
+            <w:tcW w:type="dxa" w:w="5328"/>
+            <w:tcBorders>
+              <w:top w:val="none"/>
+              <w:left w:val="none"/>
+              <w:bottom w:val="none"/>
+              <w:right w:val="none"/>
+            </w:tcBorders>
             <w:tcMar>
               <w:top w:w="0" w:type="dxa"/>
               <w:bottom w:w="0" w:type="dxa"/>
@@ -867,115 +827,103 @@
           </w:tcPr>
           <w:p>
             <w:pPr>
-              <w:spacing w:before="60" w:after="0" w:line="252" w:lineRule="auto"/>
+              <w:spacing w:before="60" w:after="10" w:line="269" w:lineRule="auto"/>
               <w:jc w:val="right"/>
             </w:pPr>
             <w:r>
               <w:rPr>
                 <w:rFonts w:ascii="Arial" w:hAnsi="Arial"/>
-                <w:color w:val="475569"/>
-                <w:sz w:val="17"/>
+                <w:b/>
+                <w:color w:val="000000"/>
+                <w:sz w:val="18"/>
               </w:rPr>
               <w:t>May 2024 – Jul 2026</w:t>
             </w:r>
           </w:p>
         </w:tc>
       </w:tr>
-      <w:tr>
-        <w:tc>
-          <w:tcPr>
-            <w:tcW w:type="dxa" w:w="7920"/>
-            <w:tcMar>
-              <w:top w:w="0" w:type="dxa"/>
-              <w:bottom w:w="0" w:type="dxa"/>
-              <w:left w:w="0" w:type="dxa"/>
-              <w:right w:w="0" w:type="dxa"/>
-            </w:tcMar>
-          </w:tcPr>
-          <w:p>
-            <w:pPr>
-              <w:spacing w:before="0" w:after="40" w:line="252" w:lineRule="auto"/>
-            </w:pPr>
-            <w:r>
-              <w:rPr>
-                <w:rFonts w:ascii="Arial" w:hAnsi="Arial"/>
-                <w:i/>
-                <w:color w:val="475569"/>
-                <w:sz w:val="18"/>
-              </w:rPr>
-              <w:t>Florida State University — Tallahassee, FL</w:t>
-            </w:r>
-          </w:p>
-        </w:tc>
-        <w:tc>
-          <w:tcPr>
-            <w:tcW w:type="dxa" w:w="2736"/>
-            <w:tcMar>
-              <w:top w:w="0" w:type="dxa"/>
-              <w:bottom w:w="0" w:type="dxa"/>
-              <w:left w:w="0" w:type="dxa"/>
-              <w:right w:w="0" w:type="dxa"/>
-            </w:tcMar>
-          </w:tcPr>
-          <w:p>
-            <w:pPr>
-              <w:spacing w:before="0" w:after="40" w:line="252" w:lineRule="auto"/>
-            </w:pPr>
-          </w:p>
-        </w:tc>
-      </w:tr>
     </w:tbl>
     <w:p>
       <w:pPr>
-        <w:pStyle w:val="ListBullet"/>
-        <w:spacing w:before="20" w:after="40" w:line="259" w:lineRule="auto"/>
-        <w:ind w:left="288"/>
+        <w:spacing w:before="10" w:after="40" w:line="269" w:lineRule="auto"/>
+      </w:pPr>
+      <w:r>
+        <w:rPr>
+          <w:rFonts w:ascii="Arial" w:hAnsi="Arial"/>
+          <w:i/>
+          <w:color w:val="464646"/>
+          <w:sz w:val="18"/>
+        </w:rPr>
+        <w:t>Florida State University — Tallahassee, FL</w:t>
+      </w:r>
+    </w:p>
+    <w:p>
+      <w:pPr>
+        <w:spacing w:before="20" w:after="40" w:line="269" w:lineRule="auto"/>
+        <w:ind w:left="259" w:hanging="259"/>
       </w:pPr>
       <w:r>
         <w:rPr>
           <w:rFonts w:ascii="Arial" w:hAnsi="Arial"/>
           <w:b/>
-          <w:color w:val="1E293B"/>
+          <w:color w:val="000000"/>
           <w:sz w:val="17"/>
         </w:rPr>
-        <w:t xml:space="preserve">Academic Research: </w:t>
+        <w:t xml:space="preserve">•  </w:t>
       </w:r>
       <w:r>
         <w:rPr>
           <w:rFonts w:ascii="Arial" w:hAnsi="Arial"/>
-          <w:color w:val="1E293B"/>
+          <w:b/>
+          <w:color w:val="000000"/>
           <w:sz w:val="17"/>
         </w:rPr>
-        <w:t>Co-authored university consumer trust study analyzing institutional decision-making frameworks.</w:t>
+        <w:t>Academic Research:</w:t>
+      </w:r>
+      <w:r>
+        <w:rPr>
+          <w:rFonts w:ascii="Arial" w:hAnsi="Arial"/>
+          <w:color w:val="282828"/>
+          <w:sz w:val="17"/>
+        </w:rPr>
+        <w:t xml:space="preserve"> Co-authored empirical consumer trust research study analyzing institutional decision-making dynamics (p &lt; .001).</w:t>
       </w:r>
     </w:p>
     <w:p>
       <w:pPr>
-        <w:pStyle w:val="ListBullet"/>
-        <w:spacing w:before="20" w:after="40" w:line="259" w:lineRule="auto"/>
-        <w:ind w:left="288"/>
+        <w:spacing w:before="20" w:after="40" w:line="269" w:lineRule="auto"/>
+        <w:ind w:left="259" w:hanging="259"/>
       </w:pPr>
       <w:r>
         <w:rPr>
           <w:rFonts w:ascii="Arial" w:hAnsi="Arial"/>
           <w:b/>
-          <w:color w:val="1E293B"/>
+          <w:color w:val="000000"/>
           <w:sz w:val="17"/>
         </w:rPr>
-        <w:t xml:space="preserve">Honors &amp; Certifications: </w:t>
+        <w:t xml:space="preserve">•  </w:t>
       </w:r>
       <w:r>
         <w:rPr>
           <w:rFonts w:ascii="Arial" w:hAnsi="Arial"/>
-          <w:color w:val="1E293B"/>
+          <w:b/>
+          <w:color w:val="000000"/>
           <w:sz w:val="17"/>
         </w:rPr>
-        <w:t>Eagle Scout (BSA) • Google AI Professional Certificate • Advanced Microsoft Excel Certified • Associate of Arts (Tallahassee State College, Dean's List 3x)</w:t>
+        <w:t>Honors &amp; Certifications:</w:t>
+      </w:r>
+      <w:r>
+        <w:rPr>
+          <w:rFonts w:ascii="Arial" w:hAnsi="Arial"/>
+          <w:color w:val="282828"/>
+          <w:sz w:val="17"/>
+        </w:rPr>
+        <w:t xml:space="preserve"> Eagle Scout (BSA) • Google AI Professional Certificate • Advanced Microsoft Excel Certified • Associate of Arts (Tallahassee State College, Dean's List 3x)</w:t>
       </w:r>
     </w:p>
     <w:sectPr>
       <w:pgSz w:w="12240" w:h="15840"/>
-      <w:pgMar w:top="691" w:right="792" w:bottom="691" w:left="792" w:header="720" w:footer="720" w:gutter="0"/>
+      <w:pgMar w:top="605" w:right="792" w:bottom="605" w:left="792" w:header="720" w:footer="720" w:gutter="0"/>
       <w:cols w:space="720"/>
       <w:docGrid w:linePitch="360"/>
     </w:sectPr>
@@ -1346,11 +1294,6 @@
     <w:name w:val="Normal"/>
     <w:qFormat/>
     <w:rsid w:val="00FC693F"/>
-    <w:rPr>
-      <w:rFonts w:ascii="Arial" w:hAnsi="Arial"/>
-      <w:color w:val="1E293B"/>
-      <w:sz w:val="19"/>
-    </w:rPr>
   </w:style>
   <w:style w:type="paragraph" w:styleId="Header">
     <w:name w:val="header"/>

</xml_diff>